<commit_message>
PCP-007 states the owner's influence rule (4/n flags, the F median decides), as the other plans; gates OK
Co-Authored-By: Claude Opus 5.5 <noreply@anthropic.com>
</commit_message>
<xml_diff>
--- a/pc_package/PCP-007_cex.docx
+++ b/pc_package/PCP-007_cex.docx
@@ -2107,7 +2107,7 @@
         </w:r>
       </w:hyperlink>
       <w:r>
-        <w:t xml:space="preserve">). Version 1.0 of this plan read</w:t>
+        <w:t xml:space="preserve">). A run with a Cook’s distance above 4/n is examined by deleting it and repeating the judgement. The model fails this test only where a run’s Cook’s distance exceeds the median of the F distribution with p and n − p degrees of freedom, where p is the number of model parameters and n the number of runs. Version 1.0 of this plan read</w:t>
       </w:r>
       <w:r>
         <w:t xml:space="preserve"> </w:t>
@@ -6326,7 +6326,7 @@
         </w:numPr>
       </w:pPr>
       <w:r>
-        <w:t xml:space="preserve">The residuals show no pattern against the predicted values or the run order, and no single run dominates the fit. The absolute residuals are regressed on the predicted values, and the residuals on the run order, and neither slope may be significant at α = 0.05. No run may have a Cook’s distance above 4/n, where n is the number of runs in the fit.</w:t>
+        <w:t xml:space="preserve">The residuals show no pattern against the predicted values or the run order, and no single run dominates the fit. The absolute residuals are regressed on the predicted values, and the residuals on the run order, and neither slope may be significant at α = 0.05. A run with a Cook’s distance above 4/n is examined by deleting it and repeating the judgement. The model fails this test only where a run’s Cook’s distance exceeds the median of the F distribution with p and n − p degrees of freedom, where p is the number of model parameters and n the number of runs.</w:t>
       </w:r>
     </w:p>
     <w:p>

</xml_diff>